<commit_message>
Fix Daftar Haadir with Bu Widi and Fix Super Kendis with pangkat
</commit_message>
<xml_diff>
--- a/public/templates/3. Super Kendis Pelatihan SE2026.docx
+++ b/public/templates/3. Super Kendis Pelatihan SE2026.docx
@@ -1200,7 +1200,6 @@
                 <w:szCs w:val="24"/>
               </w:rPr>
             </w:pPr>
-            <w:proofErr w:type="spellStart"/>
             <w:r>
               <w:rPr>
                 <w:rFonts w:ascii="Times New Roman" w:eastAsia="Times New Roman" w:hAnsi="Times New Roman" w:cs="Times New Roman"/>
@@ -1209,18 +1208,7 @@
                 <w:sz w:val="24"/>
                 <w:szCs w:val="24"/>
               </w:rPr>
-              <w:t>Pelaksana</w:t>
-            </w:r>
-            <w:proofErr w:type="spellEnd"/>
-            <w:r>
-              <w:rPr>
-                <w:rFonts w:ascii="Times New Roman" w:eastAsia="Times New Roman" w:hAnsi="Times New Roman" w:cs="Times New Roman"/>
-                <w:b/>
-                <w:bCs/>
-                <w:sz w:val="24"/>
-                <w:szCs w:val="24"/>
-              </w:rPr>
-              <w:t xml:space="preserve"> </w:t>
+              <w:t xml:space="preserve">Pelaksana </w:t>
             </w:r>
           </w:p>
           <w:p>
@@ -1236,7 +1224,6 @@
                 <w:szCs w:val="28"/>
               </w:rPr>
             </w:pPr>
-            <w:proofErr w:type="spellStart"/>
             <w:r>
               <w:rPr>
                 <w:rFonts w:ascii="Times New Roman" w:eastAsia="Times New Roman" w:hAnsi="Times New Roman" w:cs="Times New Roman"/>
@@ -1245,18 +1232,7 @@
                 <w:sz w:val="24"/>
                 <w:szCs w:val="24"/>
               </w:rPr>
-              <w:t>Perjalanan</w:t>
-            </w:r>
-            <w:proofErr w:type="spellEnd"/>
-            <w:r>
-              <w:rPr>
-                <w:rFonts w:ascii="Times New Roman" w:eastAsia="Times New Roman" w:hAnsi="Times New Roman" w:cs="Times New Roman"/>
-                <w:b/>
-                <w:bCs/>
-                <w:sz w:val="24"/>
-                <w:szCs w:val="24"/>
-              </w:rPr>
-              <w:t xml:space="preserve"> Dinas</w:t>
+              <w:t>Perjalanan Dinas</w:t>
             </w:r>
           </w:p>
         </w:tc>
@@ -1283,7 +1259,6 @@
                 <w:szCs w:val="28"/>
               </w:rPr>
             </w:pPr>
-            <w:proofErr w:type="spellStart"/>
             <w:r>
               <w:rPr>
                 <w:rFonts w:ascii="Times New Roman" w:eastAsia="Times New Roman" w:hAnsi="Times New Roman" w:cs="Times New Roman"/>
@@ -1294,7 +1269,6 @@
               </w:rPr>
               <w:t>Jabatan</w:t>
             </w:r>
-            <w:proofErr w:type="spellEnd"/>
           </w:p>
         </w:tc>
         <w:tc>
@@ -1320,7 +1294,6 @@
                 <w:szCs w:val="28"/>
               </w:rPr>
             </w:pPr>
-            <w:proofErr w:type="spellStart"/>
             <w:r>
               <w:rPr>
                 <w:rFonts w:ascii="Times New Roman" w:eastAsia="Times New Roman" w:hAnsi="Times New Roman" w:cs="Times New Roman"/>
@@ -1329,31 +1302,8 @@
                 <w:sz w:val="24"/>
                 <w:szCs w:val="24"/>
               </w:rPr>
-              <w:t>Pangkat</w:t>
+              <w:t>Pangkat/Golongan</w:t>
             </w:r>
-            <w:proofErr w:type="spellEnd"/>
-            <w:r>
-              <w:rPr>
-                <w:rFonts w:ascii="Times New Roman" w:eastAsia="Times New Roman" w:hAnsi="Times New Roman" w:cs="Times New Roman"/>
-                <w:b/>
-                <w:bCs/>
-                <w:sz w:val="24"/>
-                <w:szCs w:val="24"/>
-              </w:rPr>
-              <w:t>/</w:t>
-            </w:r>
-            <w:proofErr w:type="spellStart"/>
-            <w:r>
-              <w:rPr>
-                <w:rFonts w:ascii="Times New Roman" w:eastAsia="Times New Roman" w:hAnsi="Times New Roman" w:cs="Times New Roman"/>
-                <w:b/>
-                <w:bCs/>
-                <w:sz w:val="24"/>
-                <w:szCs w:val="24"/>
-              </w:rPr>
-              <w:t>Golongan</w:t>
-            </w:r>
-            <w:proofErr w:type="spellEnd"/>
           </w:p>
         </w:tc>
         <w:tc>
@@ -1387,20 +1337,8 @@
                 <w:sz w:val="24"/>
                 <w:szCs w:val="24"/>
               </w:rPr>
-              <w:t xml:space="preserve">Tanda </w:t>
+              <w:t>Tanda tangan</w:t>
             </w:r>
-            <w:proofErr w:type="spellStart"/>
-            <w:r>
-              <w:rPr>
-                <w:rFonts w:ascii="Times New Roman" w:eastAsia="Times New Roman" w:hAnsi="Times New Roman" w:cs="Times New Roman"/>
-                <w:b/>
-                <w:bCs/>
-                <w:sz w:val="24"/>
-                <w:szCs w:val="24"/>
-              </w:rPr>
-              <w:t>tangan</w:t>
-            </w:r>
-            <w:proofErr w:type="spellEnd"/>
           </w:p>
         </w:tc>
       </w:tr>
@@ -1435,25 +1373,7 @@
                 <w:sz w:val="24"/>
                 <w:szCs w:val="24"/>
               </w:rPr>
-              <w:t>{#</w:t>
-            </w:r>
-            <w:proofErr w:type="gramStart"/>
-            <w:r>
-              <w:rPr>
-                <w:rFonts w:ascii="Times New Roman" w:eastAsia="Times New Roman" w:hAnsi="Times New Roman" w:cs="Times New Roman"/>
-                <w:sz w:val="24"/>
-                <w:szCs w:val="24"/>
-              </w:rPr>
-              <w:t>peserta}{</w:t>
-            </w:r>
-            <w:proofErr w:type="gramEnd"/>
-            <w:r>
-              <w:rPr>
-                <w:rFonts w:ascii="Times New Roman" w:eastAsia="Times New Roman" w:hAnsi="Times New Roman" w:cs="Times New Roman"/>
-                <w:sz w:val="24"/>
-                <w:szCs w:val="24"/>
-              </w:rPr>
-              <w:t>no}</w:t>
+              <w:t>{#peserta}{no}</w:t>
             </w:r>
           </w:p>
         </w:tc>
@@ -1515,25 +1435,7 @@
                 <w:sz w:val="24"/>
                 <w:szCs w:val="24"/>
               </w:rPr>
-              <w:t>{</w:t>
-            </w:r>
-            <w:proofErr w:type="spellStart"/>
-            <w:r>
-              <w:rPr>
-                <w:rFonts w:ascii="Times New Roman" w:eastAsia="Times New Roman" w:hAnsi="Times New Roman" w:cs="Times New Roman"/>
-                <w:sz w:val="24"/>
-                <w:szCs w:val="24"/>
-              </w:rPr>
-              <w:t>jabatan</w:t>
-            </w:r>
-            <w:proofErr w:type="spellEnd"/>
-            <w:r>
-              <w:rPr>
-                <w:rFonts w:ascii="Times New Roman" w:eastAsia="Times New Roman" w:hAnsi="Times New Roman" w:cs="Times New Roman"/>
-                <w:sz w:val="24"/>
-                <w:szCs w:val="24"/>
-              </w:rPr>
-              <w:t>}</w:t>
+              <w:t>{jabatan}</w:t>
             </w:r>
           </w:p>
         </w:tc>
@@ -1564,7 +1466,7 @@
                 <w:sz w:val="24"/>
                 <w:szCs w:val="24"/>
               </w:rPr>
-              <w:t>-</w:t>
+              <w:t>{pangkat}</w:t>
             </w:r>
           </w:p>
         </w:tc>
@@ -1595,25 +1497,7 @@
                 <w:sz w:val="24"/>
                 <w:szCs w:val="24"/>
               </w:rPr>
-              <w:t>{/</w:t>
-            </w:r>
-            <w:proofErr w:type="spellStart"/>
-            <w:r>
-              <w:rPr>
-                <w:rFonts w:ascii="Times New Roman" w:eastAsia="Times New Roman" w:hAnsi="Times New Roman" w:cs="Times New Roman"/>
-                <w:sz w:val="24"/>
-                <w:szCs w:val="24"/>
-              </w:rPr>
-              <w:t>peserta</w:t>
-            </w:r>
-            <w:proofErr w:type="spellEnd"/>
-            <w:r>
-              <w:rPr>
-                <w:rFonts w:ascii="Times New Roman" w:eastAsia="Times New Roman" w:hAnsi="Times New Roman" w:cs="Times New Roman"/>
-                <w:sz w:val="24"/>
-                <w:szCs w:val="24"/>
-              </w:rPr>
-              <w:t>}</w:t>
+              <w:t>{/peserta}</w:t>
             </w:r>
           </w:p>
         </w:tc>
@@ -2214,7 +2098,7 @@
     <w:name w:val="Normal"/>
     <w:qFormat/>
   </w:style>
-  <w:style w:type="paragraph" w:styleId="Heading1">
+  <w:style w:type="paragraph" w:styleId="Judul1">
     <w:name w:val="heading 1"/>
     <w:basedOn w:val="Normal"/>
     <w:next w:val="Normal"/>
@@ -2233,7 +2117,7 @@
       <w:szCs w:val="48"/>
     </w:rPr>
   </w:style>
-  <w:style w:type="paragraph" w:styleId="Heading2">
+  <w:style w:type="paragraph" w:styleId="Judul2">
     <w:name w:val="heading 2"/>
     <w:basedOn w:val="Normal"/>
     <w:next w:val="Normal"/>
@@ -2254,7 +2138,7 @@
       <w:szCs w:val="36"/>
     </w:rPr>
   </w:style>
-  <w:style w:type="paragraph" w:styleId="Heading3">
+  <w:style w:type="paragraph" w:styleId="Judul3">
     <w:name w:val="heading 3"/>
     <w:basedOn w:val="Normal"/>
     <w:next w:val="Normal"/>
@@ -2275,7 +2159,7 @@
       <w:szCs w:val="28"/>
     </w:rPr>
   </w:style>
-  <w:style w:type="paragraph" w:styleId="Heading4">
+  <w:style w:type="paragraph" w:styleId="Judul4">
     <w:name w:val="heading 4"/>
     <w:basedOn w:val="Normal"/>
     <w:next w:val="Normal"/>
@@ -2296,7 +2180,7 @@
       <w:szCs w:val="24"/>
     </w:rPr>
   </w:style>
-  <w:style w:type="paragraph" w:styleId="Heading5">
+  <w:style w:type="paragraph" w:styleId="Judul5">
     <w:name w:val="heading 5"/>
     <w:basedOn w:val="Normal"/>
     <w:next w:val="Normal"/>
@@ -2315,7 +2199,7 @@
       <w:bCs/>
     </w:rPr>
   </w:style>
-  <w:style w:type="paragraph" w:styleId="Heading6">
+  <w:style w:type="paragraph" w:styleId="Judul6">
     <w:name w:val="heading 6"/>
     <w:basedOn w:val="Normal"/>
     <w:next w:val="Normal"/>
@@ -2336,13 +2220,13 @@
       <w:szCs w:val="20"/>
     </w:rPr>
   </w:style>
-  <w:style w:type="character" w:default="1" w:styleId="DefaultParagraphFont">
+  <w:style w:type="character" w:default="1" w:styleId="FontParagrafDefault">
     <w:name w:val="Default Paragraph Font"/>
     <w:uiPriority w:val="1"/>
     <w:semiHidden/>
     <w:unhideWhenUsed/>
   </w:style>
-  <w:style w:type="table" w:default="1" w:styleId="TableNormal">
+  <w:style w:type="table" w:default="1" w:styleId="TabelNormal">
     <w:name w:val="Normal Table"/>
     <w:uiPriority w:val="99"/>
     <w:semiHidden/>
@@ -2357,13 +2241,13 @@
       </w:tblCellMar>
     </w:tblPr>
   </w:style>
-  <w:style w:type="numbering" w:default="1" w:styleId="NoList">
+  <w:style w:type="numbering" w:default="1" w:styleId="TidakAdaDaftar">
     <w:name w:val="No List"/>
     <w:uiPriority w:val="99"/>
     <w:semiHidden/>
     <w:unhideWhenUsed/>
   </w:style>
-  <w:style w:type="table" w:customStyle="1" w:styleId="TableNormal0">
+  <w:style w:type="table" w:customStyle="1" w:styleId="TableNormal">
     <w:name w:val="TableNormal"/>
     <w:tblPr>
       <w:tblCellMar>
@@ -2374,7 +2258,7 @@
       </w:tblCellMar>
     </w:tblPr>
   </w:style>
-  <w:style w:type="paragraph" w:styleId="Title">
+  <w:style w:type="paragraph" w:styleId="Judul">
     <w:name w:val="Title"/>
     <w:basedOn w:val="Normal"/>
     <w:next w:val="Normal"/>
@@ -2392,7 +2276,7 @@
       <w:szCs w:val="72"/>
     </w:rPr>
   </w:style>
-  <w:style w:type="table" w:customStyle="1" w:styleId="TableNormal1">
+  <w:style w:type="table" w:customStyle="1" w:styleId="TableNormal0">
     <w:name w:val="TableNormal"/>
     <w:tblPr>
       <w:tblCellMar>
@@ -2400,6 +2284,17 @@
         <w:left w:w="100" w:type="dxa"/>
         <w:bottom w:w="100" w:type="dxa"/>
         <w:right w:w="100" w:type="dxa"/>
+      </w:tblCellMar>
+    </w:tblPr>
+  </w:style>
+  <w:style w:type="table" w:customStyle="1" w:styleId="TableNormal1">
+    <w:name w:val="TableNormal"/>
+    <w:tblPr>
+      <w:tblCellMar>
+        <w:top w:w="0" w:type="dxa"/>
+        <w:left w:w="0" w:type="dxa"/>
+        <w:bottom w:w="0" w:type="dxa"/>
+        <w:right w:w="0" w:type="dxa"/>
       </w:tblCellMar>
     </w:tblPr>
   </w:style>
@@ -2414,18 +2309,7 @@
       </w:tblCellMar>
     </w:tblPr>
   </w:style>
-  <w:style w:type="table" w:customStyle="1" w:styleId="TableNormal3">
-    <w:name w:val="TableNormal"/>
-    <w:tblPr>
-      <w:tblCellMar>
-        <w:top w:w="0" w:type="dxa"/>
-        <w:left w:w="0" w:type="dxa"/>
-        <w:bottom w:w="0" w:type="dxa"/>
-        <w:right w:w="0" w:type="dxa"/>
-      </w:tblCellMar>
-    </w:tblPr>
-  </w:style>
-  <w:style w:type="paragraph" w:styleId="ListParagraph">
+  <w:style w:type="paragraph" w:styleId="DaftarParagraf">
     <w:name w:val="List Paragraph"/>
     <w:basedOn w:val="Normal"/>
     <w:uiPriority w:val="34"/>
@@ -2436,9 +2320,9 @@
       <w:contextualSpacing/>
     </w:pPr>
   </w:style>
-  <w:style w:type="table" w:styleId="TableGrid">
+  <w:style w:type="table" w:styleId="KisiTabel">
     <w:name w:val="Table Grid"/>
-    <w:basedOn w:val="TableNormal"/>
+    <w:basedOn w:val="TabelNormal"/>
     <w:uiPriority w:val="59"/>
     <w:rsid w:val="006A1C9C"/>
     <w:pPr>
@@ -2455,10 +2339,10 @@
       </w:tblBorders>
     </w:tblPr>
   </w:style>
-  <w:style w:type="paragraph" w:styleId="BalloonText">
+  <w:style w:type="paragraph" w:styleId="TeksBalon">
     <w:name w:val="Balloon Text"/>
     <w:basedOn w:val="Normal"/>
-    <w:link w:val="BalloonTextChar"/>
+    <w:link w:val="TeksBalonKAR"/>
     <w:uiPriority w:val="99"/>
     <w:semiHidden/>
     <w:unhideWhenUsed/>
@@ -2472,10 +2356,10 @@
       <w:szCs w:val="18"/>
     </w:rPr>
   </w:style>
-  <w:style w:type="character" w:customStyle="1" w:styleId="BalloonTextChar">
-    <w:name w:val="Balloon Text Char"/>
-    <w:basedOn w:val="DefaultParagraphFont"/>
-    <w:link w:val="BalloonText"/>
+  <w:style w:type="character" w:customStyle="1" w:styleId="TeksBalonKAR">
+    <w:name w:val="Teks Balon KAR"/>
+    <w:basedOn w:val="FontParagrafDefault"/>
+    <w:link w:val="TeksBalon"/>
     <w:uiPriority w:val="99"/>
     <w:semiHidden/>
     <w:rsid w:val="00FB79C3"/>
@@ -2485,9 +2369,9 @@
       <w:szCs w:val="18"/>
     </w:rPr>
   </w:style>
-  <w:style w:type="character" w:styleId="CommentReference">
+  <w:style w:type="character" w:styleId="ReferensiKomentar">
     <w:name w:val="annotation reference"/>
-    <w:basedOn w:val="DefaultParagraphFont"/>
+    <w:basedOn w:val="FontParagrafDefault"/>
     <w:uiPriority w:val="99"/>
     <w:semiHidden/>
     <w:unhideWhenUsed/>
@@ -2497,10 +2381,10 @@
       <w:szCs w:val="16"/>
     </w:rPr>
   </w:style>
-  <w:style w:type="paragraph" w:styleId="CommentText">
+  <w:style w:type="paragraph" w:styleId="TeksKomentar">
     <w:name w:val="annotation text"/>
     <w:basedOn w:val="Normal"/>
-    <w:link w:val="CommentTextChar"/>
+    <w:link w:val="TeksKomentarKAR"/>
     <w:uiPriority w:val="99"/>
     <w:unhideWhenUsed/>
     <w:rsid w:val="00F25537"/>
@@ -2512,10 +2396,10 @@
       <w:szCs w:val="20"/>
     </w:rPr>
   </w:style>
-  <w:style w:type="character" w:customStyle="1" w:styleId="CommentTextChar">
-    <w:name w:val="Comment Text Char"/>
-    <w:basedOn w:val="DefaultParagraphFont"/>
-    <w:link w:val="CommentText"/>
+  <w:style w:type="character" w:customStyle="1" w:styleId="TeksKomentarKAR">
+    <w:name w:val="Teks Komentar KAR"/>
+    <w:basedOn w:val="FontParagrafDefault"/>
+    <w:link w:val="TeksKomentar"/>
     <w:uiPriority w:val="99"/>
     <w:rsid w:val="00F25537"/>
     <w:rPr>
@@ -2523,11 +2407,11 @@
       <w:szCs w:val="20"/>
     </w:rPr>
   </w:style>
-  <w:style w:type="paragraph" w:styleId="CommentSubject">
+  <w:style w:type="paragraph" w:styleId="SubjekKomentar">
     <w:name w:val="annotation subject"/>
-    <w:basedOn w:val="CommentText"/>
-    <w:next w:val="CommentText"/>
-    <w:link w:val="CommentSubjectChar"/>
+    <w:basedOn w:val="TeksKomentar"/>
+    <w:next w:val="TeksKomentar"/>
+    <w:link w:val="SubjekKomentarKAR"/>
     <w:uiPriority w:val="99"/>
     <w:semiHidden/>
     <w:unhideWhenUsed/>
@@ -2537,10 +2421,10 @@
       <w:bCs/>
     </w:rPr>
   </w:style>
-  <w:style w:type="character" w:customStyle="1" w:styleId="CommentSubjectChar">
-    <w:name w:val="Comment Subject Char"/>
-    <w:basedOn w:val="CommentTextChar"/>
-    <w:link w:val="CommentSubject"/>
+  <w:style w:type="character" w:customStyle="1" w:styleId="SubjekKomentarKAR">
+    <w:name w:val="Subjek Komentar KAR"/>
+    <w:basedOn w:val="TeksKomentarKAR"/>
+    <w:link w:val="SubjekKomentar"/>
     <w:uiPriority w:val="99"/>
     <w:semiHidden/>
     <w:rsid w:val="00F25537"/>
@@ -2552,7 +2436,7 @@
     </w:rPr>
   </w:style>
   <w:style w:type="table" w:customStyle="1" w:styleId="a">
-    <w:basedOn w:val="TableNormal"/>
+    <w:basedOn w:val="TabelNormal"/>
     <w:pPr>
       <w:spacing w:after="0" w:line="240" w:lineRule="auto"/>
     </w:pPr>
@@ -2562,7 +2446,7 @@
     </w:tblPr>
   </w:style>
   <w:style w:type="table" w:customStyle="1" w:styleId="a0">
-    <w:basedOn w:val="TableNormal"/>
+    <w:basedOn w:val="TabelNormal"/>
     <w:pPr>
       <w:spacing w:after="0" w:line="240" w:lineRule="auto"/>
     </w:pPr>
@@ -2572,7 +2456,7 @@
     </w:tblPr>
   </w:style>
   <w:style w:type="table" w:customStyle="1" w:styleId="a1">
-    <w:basedOn w:val="TableNormal"/>
+    <w:basedOn w:val="TabelNormal"/>
     <w:pPr>
       <w:spacing w:after="0" w:line="240" w:lineRule="auto"/>
     </w:pPr>
@@ -2582,13 +2466,13 @@
     </w:tblPr>
   </w:style>
   <w:style w:type="table" w:customStyle="1" w:styleId="a2">
-    <w:basedOn w:val="TableNormal"/>
+    <w:basedOn w:val="TabelNormal"/>
     <w:tblPr>
       <w:tblStyleRowBandSize w:val="1"/>
       <w:tblStyleColBandSize w:val="1"/>
     </w:tblPr>
   </w:style>
-  <w:style w:type="paragraph" w:styleId="Subtitle">
+  <w:style w:type="paragraph" w:styleId="Subjudul">
     <w:name w:val="Subtitle"/>
     <w:basedOn w:val="Normal"/>
     <w:next w:val="Normal"/>
@@ -2609,7 +2493,7 @@
     </w:rPr>
   </w:style>
   <w:style w:type="table" w:customStyle="1" w:styleId="a3">
-    <w:basedOn w:val="TableNormal"/>
+    <w:basedOn w:val="TabelNormal"/>
     <w:pPr>
       <w:spacing w:after="0" w:line="240" w:lineRule="auto"/>
     </w:pPr>
@@ -2619,7 +2503,7 @@
     </w:tblPr>
   </w:style>
   <w:style w:type="table" w:customStyle="1" w:styleId="a4">
-    <w:basedOn w:val="TableNormal"/>
+    <w:basedOn w:val="TabelNormal"/>
     <w:tblPr>
       <w:tblStyleRowBandSize w:val="1"/>
       <w:tblStyleColBandSize w:val="1"/>

</xml_diff>

<commit_message>
Fix Template and Fitur SPJ
</commit_message>
<xml_diff>
--- a/public/templates/3. Super Kendis Pelatihan SE2026.docx
+++ b/public/templates/3. Super Kendis Pelatihan SE2026.docx
@@ -1142,6 +1142,9 @@
         <w:gridCol w:w="1989"/>
       </w:tblGrid>
       <w:tr>
+        <w:trPr>
+          <w:trHeight w:val="20"/>
+        </w:trPr>
         <w:tc>
           <w:tcPr>
             <w:tcW w:w="660" w:type="dxa"/>
@@ -1200,6 +1203,7 @@
                 <w:szCs w:val="24"/>
               </w:rPr>
             </w:pPr>
+            <w:proofErr w:type="spellStart"/>
             <w:r>
               <w:rPr>
                 <w:rFonts w:ascii="Times New Roman" w:eastAsia="Times New Roman" w:hAnsi="Times New Roman" w:cs="Times New Roman"/>
@@ -1208,7 +1212,18 @@
                 <w:sz w:val="24"/>
                 <w:szCs w:val="24"/>
               </w:rPr>
-              <w:t xml:space="preserve">Pelaksana </w:t>
+              <w:t>Pelaksana</w:t>
+            </w:r>
+            <w:proofErr w:type="spellEnd"/>
+            <w:r>
+              <w:rPr>
+                <w:rFonts w:ascii="Times New Roman" w:eastAsia="Times New Roman" w:hAnsi="Times New Roman" w:cs="Times New Roman"/>
+                <w:b/>
+                <w:bCs/>
+                <w:sz w:val="24"/>
+                <w:szCs w:val="24"/>
+              </w:rPr>
+              <w:t xml:space="preserve"> </w:t>
             </w:r>
           </w:p>
           <w:p>
@@ -1224,6 +1239,7 @@
                 <w:szCs w:val="28"/>
               </w:rPr>
             </w:pPr>
+            <w:proofErr w:type="spellStart"/>
             <w:r>
               <w:rPr>
                 <w:rFonts w:ascii="Times New Roman" w:eastAsia="Times New Roman" w:hAnsi="Times New Roman" w:cs="Times New Roman"/>
@@ -1232,7 +1248,18 @@
                 <w:sz w:val="24"/>
                 <w:szCs w:val="24"/>
               </w:rPr>
-              <w:t>Perjalanan Dinas</w:t>
+              <w:t>Perjalanan</w:t>
+            </w:r>
+            <w:proofErr w:type="spellEnd"/>
+            <w:r>
+              <w:rPr>
+                <w:rFonts w:ascii="Times New Roman" w:eastAsia="Times New Roman" w:hAnsi="Times New Roman" w:cs="Times New Roman"/>
+                <w:b/>
+                <w:bCs/>
+                <w:sz w:val="24"/>
+                <w:szCs w:val="24"/>
+              </w:rPr>
+              <w:t xml:space="preserve"> Dinas</w:t>
             </w:r>
           </w:p>
         </w:tc>
@@ -1259,6 +1286,7 @@
                 <w:szCs w:val="28"/>
               </w:rPr>
             </w:pPr>
+            <w:proofErr w:type="spellStart"/>
             <w:r>
               <w:rPr>
                 <w:rFonts w:ascii="Times New Roman" w:eastAsia="Times New Roman" w:hAnsi="Times New Roman" w:cs="Times New Roman"/>
@@ -1269,6 +1297,7 @@
               </w:rPr>
               <w:t>Jabatan</w:t>
             </w:r>
+            <w:proofErr w:type="spellEnd"/>
           </w:p>
         </w:tc>
         <w:tc>
@@ -1294,6 +1323,7 @@
                 <w:szCs w:val="28"/>
               </w:rPr>
             </w:pPr>
+            <w:proofErr w:type="spellStart"/>
             <w:r>
               <w:rPr>
                 <w:rFonts w:ascii="Times New Roman" w:eastAsia="Times New Roman" w:hAnsi="Times New Roman" w:cs="Times New Roman"/>
@@ -1302,8 +1332,31 @@
                 <w:sz w:val="24"/>
                 <w:szCs w:val="24"/>
               </w:rPr>
-              <w:t>Pangkat/Golongan</w:t>
+              <w:t>Pangkat</w:t>
             </w:r>
+            <w:proofErr w:type="spellEnd"/>
+            <w:r>
+              <w:rPr>
+                <w:rFonts w:ascii="Times New Roman" w:eastAsia="Times New Roman" w:hAnsi="Times New Roman" w:cs="Times New Roman"/>
+                <w:b/>
+                <w:bCs/>
+                <w:sz w:val="24"/>
+                <w:szCs w:val="24"/>
+              </w:rPr>
+              <w:t>/</w:t>
+            </w:r>
+            <w:proofErr w:type="spellStart"/>
+            <w:r>
+              <w:rPr>
+                <w:rFonts w:ascii="Times New Roman" w:eastAsia="Times New Roman" w:hAnsi="Times New Roman" w:cs="Times New Roman"/>
+                <w:b/>
+                <w:bCs/>
+                <w:sz w:val="24"/>
+                <w:szCs w:val="24"/>
+              </w:rPr>
+              <w:t>Golongan</w:t>
+            </w:r>
+            <w:proofErr w:type="spellEnd"/>
           </w:p>
         </w:tc>
         <w:tc>
@@ -1337,14 +1390,26 @@
                 <w:sz w:val="24"/>
                 <w:szCs w:val="24"/>
               </w:rPr>
-              <w:t>Tanda tangan</w:t>
+              <w:t xml:space="preserve">Tanda </w:t>
             </w:r>
+            <w:proofErr w:type="spellStart"/>
+            <w:r>
+              <w:rPr>
+                <w:rFonts w:ascii="Times New Roman" w:eastAsia="Times New Roman" w:hAnsi="Times New Roman" w:cs="Times New Roman"/>
+                <w:b/>
+                <w:bCs/>
+                <w:sz w:val="24"/>
+                <w:szCs w:val="24"/>
+              </w:rPr>
+              <w:t>tangan</w:t>
+            </w:r>
+            <w:proofErr w:type="spellEnd"/>
           </w:p>
         </w:tc>
       </w:tr>
       <w:tr>
         <w:trPr>
-          <w:trHeight w:val="920"/>
+          <w:trHeight w:val="663"/>
         </w:trPr>
         <w:tc>
           <w:tcPr>
@@ -1373,7 +1438,25 @@
                 <w:sz w:val="24"/>
                 <w:szCs w:val="24"/>
               </w:rPr>
-              <w:t>{#peserta}{no}</w:t>
+              <w:t>{#</w:t>
+            </w:r>
+            <w:proofErr w:type="gramStart"/>
+            <w:r>
+              <w:rPr>
+                <w:rFonts w:ascii="Times New Roman" w:eastAsia="Times New Roman" w:hAnsi="Times New Roman" w:cs="Times New Roman"/>
+                <w:sz w:val="24"/>
+                <w:szCs w:val="24"/>
+              </w:rPr>
+              <w:t>peserta}{</w:t>
+            </w:r>
+            <w:proofErr w:type="gramEnd"/>
+            <w:r>
+              <w:rPr>
+                <w:rFonts w:ascii="Times New Roman" w:eastAsia="Times New Roman" w:hAnsi="Times New Roman" w:cs="Times New Roman"/>
+                <w:sz w:val="24"/>
+                <w:szCs w:val="24"/>
+              </w:rPr>
+              <w:t>no}</w:t>
             </w:r>
           </w:p>
         </w:tc>
@@ -1435,7 +1518,25 @@
                 <w:sz w:val="24"/>
                 <w:szCs w:val="24"/>
               </w:rPr>
-              <w:t>{jabatan}</w:t>
+              <w:t>{</w:t>
+            </w:r>
+            <w:proofErr w:type="spellStart"/>
+            <w:r>
+              <w:rPr>
+                <w:rFonts w:ascii="Times New Roman" w:eastAsia="Times New Roman" w:hAnsi="Times New Roman" w:cs="Times New Roman"/>
+                <w:sz w:val="24"/>
+                <w:szCs w:val="24"/>
+              </w:rPr>
+              <w:t>jabatan</w:t>
+            </w:r>
+            <w:proofErr w:type="spellEnd"/>
+            <w:r>
+              <w:rPr>
+                <w:rFonts w:ascii="Times New Roman" w:eastAsia="Times New Roman" w:hAnsi="Times New Roman" w:cs="Times New Roman"/>
+                <w:sz w:val="24"/>
+                <w:szCs w:val="24"/>
+              </w:rPr>
+              <w:t>}</w:t>
             </w:r>
           </w:p>
         </w:tc>
@@ -1466,7 +1567,25 @@
                 <w:sz w:val="24"/>
                 <w:szCs w:val="24"/>
               </w:rPr>
-              <w:t>{pangkat}</w:t>
+              <w:t>{</w:t>
+            </w:r>
+            <w:proofErr w:type="spellStart"/>
+            <w:r>
+              <w:rPr>
+                <w:rFonts w:ascii="Times New Roman" w:eastAsia="Times New Roman" w:hAnsi="Times New Roman" w:cs="Times New Roman"/>
+                <w:sz w:val="24"/>
+                <w:szCs w:val="24"/>
+              </w:rPr>
+              <w:t>pangkat</w:t>
+            </w:r>
+            <w:proofErr w:type="spellEnd"/>
+            <w:r>
+              <w:rPr>
+                <w:rFonts w:ascii="Times New Roman" w:eastAsia="Times New Roman" w:hAnsi="Times New Roman" w:cs="Times New Roman"/>
+                <w:sz w:val="24"/>
+                <w:szCs w:val="24"/>
+              </w:rPr>
+              <w:t>}</w:t>
             </w:r>
           </w:p>
         </w:tc>
@@ -1497,7 +1616,25 @@
                 <w:sz w:val="24"/>
                 <w:szCs w:val="24"/>
               </w:rPr>
-              <w:t>{/peserta}</w:t>
+              <w:t>{/</w:t>
+            </w:r>
+            <w:proofErr w:type="spellStart"/>
+            <w:r>
+              <w:rPr>
+                <w:rFonts w:ascii="Times New Roman" w:eastAsia="Times New Roman" w:hAnsi="Times New Roman" w:cs="Times New Roman"/>
+                <w:sz w:val="24"/>
+                <w:szCs w:val="24"/>
+              </w:rPr>
+              <w:t>peserta</w:t>
+            </w:r>
+            <w:proofErr w:type="spellEnd"/>
+            <w:r>
+              <w:rPr>
+                <w:rFonts w:ascii="Times New Roman" w:eastAsia="Times New Roman" w:hAnsi="Times New Roman" w:cs="Times New Roman"/>
+                <w:sz w:val="24"/>
+                <w:szCs w:val="24"/>
+              </w:rPr>
+              <w:t>}</w:t>
             </w:r>
           </w:p>
         </w:tc>

</xml_diff>

<commit_message>
Fix Template Word Super Kendis
</commit_message>
<xml_diff>
--- a/public/templates/3. Super Kendis Pelatihan SE2026.docx
+++ b/public/templates/3. Super Kendis Pelatihan SE2026.docx
@@ -1474,7 +1474,7 @@
             <w:pPr>
               <w:spacing w:after="0"/>
               <w:ind w:left="-20"/>
-              <w:jc w:val="center"/>
+              <w:jc w:val="both"/>
               <w:rPr>
                 <w:rFonts w:ascii="Times New Roman" w:eastAsia="Times New Roman" w:hAnsi="Times New Roman" w:cs="Times New Roman"/>
                 <w:sz w:val="28"/>
@@ -1554,7 +1554,7 @@
             <w:pPr>
               <w:spacing w:after="0"/>
               <w:ind w:left="-20"/>
-              <w:jc w:val="center"/>
+              <w:jc w:val="both"/>
               <w:rPr>
                 <w:rFonts w:ascii="Times New Roman" w:eastAsia="Times New Roman" w:hAnsi="Times New Roman" w:cs="Times New Roman"/>
                 <w:sz w:val="24"/>

</xml_diff>

<commit_message>
ubah super kendis dan dpr format untuk gel 2
</commit_message>
<xml_diff>
--- a/public/templates/3. Super Kendis Pelatihan SE2026.docx
+++ b/public/templates/3. Super Kendis Pelatihan SE2026.docx
@@ -1170,8 +1170,6 @@
                 <w:rFonts w:ascii="Times New Roman" w:eastAsia="Times New Roman" w:hAnsi="Times New Roman" w:cs="Times New Roman"/>
                 <w:b/>
                 <w:bCs/>
-                <w:sz w:val="28"/>
-                <w:szCs w:val="28"/>
               </w:rPr>
             </w:pPr>
             <w:r>
@@ -1179,8 +1177,6 @@
                 <w:rFonts w:ascii="Times New Roman" w:eastAsia="Times New Roman" w:hAnsi="Times New Roman" w:cs="Times New Roman"/>
                 <w:b/>
                 <w:bCs/>
-                <w:sz w:val="24"/>
-                <w:szCs w:val="24"/>
               </w:rPr>
               <w:t>No</w:t>
             </w:r>
@@ -1205,8 +1201,6 @@
                 <w:rFonts w:ascii="Times New Roman" w:eastAsia="Times New Roman" w:hAnsi="Times New Roman" w:cs="Times New Roman"/>
                 <w:b/>
                 <w:bCs/>
-                <w:sz w:val="24"/>
-                <w:szCs w:val="24"/>
               </w:rPr>
             </w:pPr>
             <w:proofErr w:type="spellStart"/>
@@ -1215,8 +1209,6 @@
                 <w:rFonts w:ascii="Times New Roman" w:eastAsia="Times New Roman" w:hAnsi="Times New Roman" w:cs="Times New Roman"/>
                 <w:b/>
                 <w:bCs/>
-                <w:sz w:val="24"/>
-                <w:szCs w:val="24"/>
               </w:rPr>
               <w:t>Pelaksana</w:t>
             </w:r>
@@ -1226,8 +1218,6 @@
                 <w:rFonts w:ascii="Times New Roman" w:eastAsia="Times New Roman" w:hAnsi="Times New Roman" w:cs="Times New Roman"/>
                 <w:b/>
                 <w:bCs/>
-                <w:sz w:val="24"/>
-                <w:szCs w:val="24"/>
               </w:rPr>
               <w:t xml:space="preserve"> </w:t>
             </w:r>
@@ -1241,8 +1231,6 @@
                 <w:rFonts w:ascii="Times New Roman" w:eastAsia="Times New Roman" w:hAnsi="Times New Roman" w:cs="Times New Roman"/>
                 <w:b/>
                 <w:bCs/>
-                <w:sz w:val="28"/>
-                <w:szCs w:val="28"/>
               </w:rPr>
             </w:pPr>
             <w:proofErr w:type="spellStart"/>
@@ -1251,8 +1239,6 @@
                 <w:rFonts w:ascii="Times New Roman" w:eastAsia="Times New Roman" w:hAnsi="Times New Roman" w:cs="Times New Roman"/>
                 <w:b/>
                 <w:bCs/>
-                <w:sz w:val="24"/>
-                <w:szCs w:val="24"/>
               </w:rPr>
               <w:t>Perjalanan</w:t>
             </w:r>
@@ -1262,8 +1248,6 @@
                 <w:rFonts w:ascii="Times New Roman" w:eastAsia="Times New Roman" w:hAnsi="Times New Roman" w:cs="Times New Roman"/>
                 <w:b/>
                 <w:bCs/>
-                <w:sz w:val="24"/>
-                <w:szCs w:val="24"/>
               </w:rPr>
               <w:t xml:space="preserve"> Dinas</w:t>
             </w:r>
@@ -1288,8 +1272,6 @@
                 <w:rFonts w:ascii="Times New Roman" w:eastAsia="Times New Roman" w:hAnsi="Times New Roman" w:cs="Times New Roman"/>
                 <w:b/>
                 <w:bCs/>
-                <w:sz w:val="28"/>
-                <w:szCs w:val="28"/>
               </w:rPr>
             </w:pPr>
             <w:proofErr w:type="spellStart"/>
@@ -1298,8 +1280,6 @@
                 <w:rFonts w:ascii="Times New Roman" w:eastAsia="Times New Roman" w:hAnsi="Times New Roman" w:cs="Times New Roman"/>
                 <w:b/>
                 <w:bCs/>
-                <w:sz w:val="24"/>
-                <w:szCs w:val="24"/>
               </w:rPr>
               <w:t>Jabatan</w:t>
             </w:r>
@@ -1325,8 +1305,6 @@
                 <w:rFonts w:ascii="Times New Roman" w:eastAsia="Times New Roman" w:hAnsi="Times New Roman" w:cs="Times New Roman"/>
                 <w:b/>
                 <w:bCs/>
-                <w:sz w:val="28"/>
-                <w:szCs w:val="28"/>
               </w:rPr>
             </w:pPr>
             <w:proofErr w:type="spellStart"/>
@@ -1335,8 +1313,6 @@
                 <w:rFonts w:ascii="Times New Roman" w:eastAsia="Times New Roman" w:hAnsi="Times New Roman" w:cs="Times New Roman"/>
                 <w:b/>
                 <w:bCs/>
-                <w:sz w:val="24"/>
-                <w:szCs w:val="24"/>
               </w:rPr>
               <w:t>Pangkat</w:t>
             </w:r>
@@ -1346,8 +1322,6 @@
                 <w:rFonts w:ascii="Times New Roman" w:eastAsia="Times New Roman" w:hAnsi="Times New Roman" w:cs="Times New Roman"/>
                 <w:b/>
                 <w:bCs/>
-                <w:sz w:val="24"/>
-                <w:szCs w:val="24"/>
               </w:rPr>
               <w:t>/</w:t>
             </w:r>
@@ -1357,8 +1331,6 @@
                 <w:rFonts w:ascii="Times New Roman" w:eastAsia="Times New Roman" w:hAnsi="Times New Roman" w:cs="Times New Roman"/>
                 <w:b/>
                 <w:bCs/>
-                <w:sz w:val="24"/>
-                <w:szCs w:val="24"/>
               </w:rPr>
               <w:t>Golongan</w:t>
             </w:r>
@@ -1384,8 +1356,6 @@
                 <w:rFonts w:ascii="Times New Roman" w:eastAsia="Times New Roman" w:hAnsi="Times New Roman" w:cs="Times New Roman"/>
                 <w:b/>
                 <w:bCs/>
-                <w:sz w:val="28"/>
-                <w:szCs w:val="28"/>
               </w:rPr>
             </w:pPr>
             <w:r>
@@ -1393,8 +1363,6 @@
                 <w:rFonts w:ascii="Times New Roman" w:eastAsia="Times New Roman" w:hAnsi="Times New Roman" w:cs="Times New Roman"/>
                 <w:b/>
                 <w:bCs/>
-                <w:sz w:val="24"/>
-                <w:szCs w:val="24"/>
               </w:rPr>
               <w:t xml:space="preserve">Tanda </w:t>
             </w:r>
@@ -1404,8 +1372,6 @@
                 <w:rFonts w:ascii="Times New Roman" w:eastAsia="Times New Roman" w:hAnsi="Times New Roman" w:cs="Times New Roman"/>
                 <w:b/>
                 <w:bCs/>
-                <w:sz w:val="24"/>
-                <w:szCs w:val="24"/>
               </w:rPr>
               <w:t>tangan</w:t>
             </w:r>
@@ -1415,7 +1381,7 @@
       </w:tr>
       <w:tr>
         <w:trPr>
-          <w:trHeight w:val="663"/>
+          <w:trHeight w:val="933"/>
         </w:trPr>
         <w:tc>
           <w:tcPr>
@@ -1434,15 +1400,11 @@
               <w:jc w:val="center"/>
               <w:rPr>
                 <w:rFonts w:ascii="Times New Roman" w:eastAsia="Times New Roman" w:hAnsi="Times New Roman" w:cs="Times New Roman"/>
-                <w:sz w:val="28"/>
-                <w:szCs w:val="28"/>
-              </w:rPr>
-            </w:pPr>
-            <w:r>
-              <w:rPr>
-                <w:rFonts w:ascii="Times New Roman" w:eastAsia="Times New Roman" w:hAnsi="Times New Roman" w:cs="Times New Roman"/>
-                <w:sz w:val="24"/>
-                <w:szCs w:val="24"/>
+              </w:rPr>
+            </w:pPr>
+            <w:r>
+              <w:rPr>
+                <w:rFonts w:ascii="Times New Roman" w:eastAsia="Times New Roman" w:hAnsi="Times New Roman" w:cs="Times New Roman"/>
               </w:rPr>
               <w:t>{#</w:t>
             </w:r>
@@ -1450,8 +1412,6 @@
             <w:r>
               <w:rPr>
                 <w:rFonts w:ascii="Times New Roman" w:eastAsia="Times New Roman" w:hAnsi="Times New Roman" w:cs="Times New Roman"/>
-                <w:sz w:val="24"/>
-                <w:szCs w:val="24"/>
               </w:rPr>
               <w:t>peserta}{</w:t>
             </w:r>
@@ -1459,8 +1419,6 @@
             <w:r>
               <w:rPr>
                 <w:rFonts w:ascii="Times New Roman" w:eastAsia="Times New Roman" w:hAnsi="Times New Roman" w:cs="Times New Roman"/>
-                <w:sz w:val="24"/>
-                <w:szCs w:val="24"/>
               </w:rPr>
               <w:t>no}</w:t>
             </w:r>
@@ -1483,15 +1441,11 @@
               <w:jc w:val="both"/>
               <w:rPr>
                 <w:rFonts w:ascii="Times New Roman" w:eastAsia="Times New Roman" w:hAnsi="Times New Roman" w:cs="Times New Roman"/>
-                <w:sz w:val="28"/>
-                <w:szCs w:val="28"/>
-              </w:rPr>
-            </w:pPr>
-            <w:r>
-              <w:rPr>
-                <w:rFonts w:ascii="Times New Roman" w:eastAsia="Times New Roman" w:hAnsi="Times New Roman" w:cs="Times New Roman"/>
-                <w:sz w:val="24"/>
-                <w:szCs w:val="24"/>
+              </w:rPr>
+            </w:pPr>
+            <w:r>
+              <w:rPr>
+                <w:rFonts w:ascii="Times New Roman" w:eastAsia="Times New Roman" w:hAnsi="Times New Roman" w:cs="Times New Roman"/>
               </w:rPr>
               <w:t>{nama}</w:t>
             </w:r>
@@ -1514,15 +1468,11 @@
               <w:jc w:val="center"/>
               <w:rPr>
                 <w:rFonts w:ascii="Times New Roman" w:eastAsia="Times New Roman" w:hAnsi="Times New Roman" w:cs="Times New Roman"/>
-                <w:sz w:val="24"/>
-                <w:szCs w:val="24"/>
-              </w:rPr>
-            </w:pPr>
-            <w:r>
-              <w:rPr>
-                <w:rFonts w:ascii="Times New Roman" w:eastAsia="Times New Roman" w:hAnsi="Times New Roman" w:cs="Times New Roman"/>
-                <w:sz w:val="24"/>
-                <w:szCs w:val="24"/>
+              </w:rPr>
+            </w:pPr>
+            <w:r>
+              <w:rPr>
+                <w:rFonts w:ascii="Times New Roman" w:eastAsia="Times New Roman" w:hAnsi="Times New Roman" w:cs="Times New Roman"/>
               </w:rPr>
               <w:t>{</w:t>
             </w:r>
@@ -1530,8 +1480,6 @@
             <w:r>
               <w:rPr>
                 <w:rFonts w:ascii="Times New Roman" w:eastAsia="Times New Roman" w:hAnsi="Times New Roman" w:cs="Times New Roman"/>
-                <w:sz w:val="24"/>
-                <w:szCs w:val="24"/>
               </w:rPr>
               <w:t>jabatan</w:t>
             </w:r>
@@ -1539,8 +1487,6 @@
             <w:r>
               <w:rPr>
                 <w:rFonts w:ascii="Times New Roman" w:eastAsia="Times New Roman" w:hAnsi="Times New Roman" w:cs="Times New Roman"/>
-                <w:sz w:val="24"/>
-                <w:szCs w:val="24"/>
               </w:rPr>
               <w:t>}</w:t>
             </w:r>
@@ -1563,15 +1509,11 @@
               <w:jc w:val="center"/>
               <w:rPr>
                 <w:rFonts w:ascii="Times New Roman" w:eastAsia="Times New Roman" w:hAnsi="Times New Roman" w:cs="Times New Roman"/>
-                <w:sz w:val="24"/>
-                <w:szCs w:val="24"/>
-              </w:rPr>
-            </w:pPr>
-            <w:r>
-              <w:rPr>
-                <w:rFonts w:ascii="Times New Roman" w:eastAsia="Times New Roman" w:hAnsi="Times New Roman" w:cs="Times New Roman"/>
-                <w:sz w:val="24"/>
-                <w:szCs w:val="24"/>
+              </w:rPr>
+            </w:pPr>
+            <w:r>
+              <w:rPr>
+                <w:rFonts w:ascii="Times New Roman" w:eastAsia="Times New Roman" w:hAnsi="Times New Roman" w:cs="Times New Roman"/>
               </w:rPr>
               <w:t>{</w:t>
             </w:r>
@@ -1579,8 +1521,6 @@
             <w:r>
               <w:rPr>
                 <w:rFonts w:ascii="Times New Roman" w:eastAsia="Times New Roman" w:hAnsi="Times New Roman" w:cs="Times New Roman"/>
-                <w:sz w:val="24"/>
-                <w:szCs w:val="24"/>
               </w:rPr>
               <w:t>pangkat</w:t>
             </w:r>
@@ -1588,8 +1528,6 @@
             <w:r>
               <w:rPr>
                 <w:rFonts w:ascii="Times New Roman" w:eastAsia="Times New Roman" w:hAnsi="Times New Roman" w:cs="Times New Roman"/>
-                <w:sz w:val="24"/>
-                <w:szCs w:val="24"/>
               </w:rPr>
               <w:t>}</w:t>
             </w:r>
@@ -1612,15 +1550,11 @@
               <w:jc w:val="center"/>
               <w:rPr>
                 <w:rFonts w:ascii="Times New Roman" w:eastAsia="Times New Roman" w:hAnsi="Times New Roman" w:cs="Times New Roman"/>
-                <w:sz w:val="24"/>
-                <w:szCs w:val="24"/>
-              </w:rPr>
-            </w:pPr>
-            <w:r>
-              <w:rPr>
-                <w:rFonts w:ascii="Times New Roman" w:eastAsia="Times New Roman" w:hAnsi="Times New Roman" w:cs="Times New Roman"/>
-                <w:sz w:val="24"/>
-                <w:szCs w:val="24"/>
+              </w:rPr>
+            </w:pPr>
+            <w:r>
+              <w:rPr>
+                <w:rFonts w:ascii="Times New Roman" w:eastAsia="Times New Roman" w:hAnsi="Times New Roman" w:cs="Times New Roman"/>
               </w:rPr>
               <w:t>{/</w:t>
             </w:r>
@@ -1628,8 +1562,6 @@
             <w:r>
               <w:rPr>
                 <w:rFonts w:ascii="Times New Roman" w:eastAsia="Times New Roman" w:hAnsi="Times New Roman" w:cs="Times New Roman"/>
-                <w:sz w:val="24"/>
-                <w:szCs w:val="24"/>
               </w:rPr>
               <w:t>peserta</w:t>
             </w:r>
@@ -1637,8 +1569,6 @@
             <w:r>
               <w:rPr>
                 <w:rFonts w:ascii="Times New Roman" w:eastAsia="Times New Roman" w:hAnsi="Times New Roman" w:cs="Times New Roman"/>
-                <w:sz w:val="24"/>
-                <w:szCs w:val="24"/>
               </w:rPr>
               <w:t>}</w:t>
             </w:r>

</xml_diff>